<commit_message>
PAUSED (task177): stage 4 round 1 fixes, waiting on round 2 readers
Round 1 on target.zip 4827dc5d: judge DETERMINISTIC (hygiene only), both readers filed the call at 10,
the asks leaked (9 of 21, 21 of 21). Ask A's primary re-sited onto the bill path: 453 app acceptances
the engine never applied are billed at the app's half-price rate with no discount line. Ask B's onto
the line path: 921 households' two same-plan subscriptions are billed on one line under the list
subscription ("x 2"). Reader B's quoted routes and both credit-note variants keep 0 of 21 in
cracker.py. Hygiene: validation floor 0.20, the plan's send date, the list's send-day name, the
credits pinned in the prompt. Call and every call-side row frozen at round 1's bytes; figures.json
unchanged. checks 141 of 141, verify 35 of 35, rebuild identical, zip cc5a56de.

Co-Authored-By: Claude Opus 5.5 <noreply@anthropic.com>
Claude-Session: https://claude.ai/code/session_01A6XcFx5t62c7gPi1bBKcVi
</commit_message>
<xml_diff>
--- a/task177/golden/january_offer_note.docx
+++ b/task177/golden/january_offer_note.docx
@@ -191,6 +191,15 @@
           <w:sz w:val="17"/>
         </w:rPr>
         <w:t>2. The save desk's own half price uses the same billing code as the offer and is not counted as the offer.</w:t>
+      </w:r>
+    </w:p>
+    <w:p>
+      <w:r>
+        <w:rPr>
+          <w:color w:val="5F6670"/>
+          <w:sz w:val="17"/>
+        </w:rPr>
+        <w:t>3. App acceptances the offers engine did not apply were billed at the app's half-price rate, with no discount line; they are counted as takers and their discounts in the cost.</w:t>
       </w:r>
     </w:p>
     <w:sectPr>

</xml_diff>